<commit_message>
Visual interface of History Screen is updated
</commit_message>
<xml_diff>
--- a/Assignment3/Design Document v3.docx
+++ b/Assignment3/Design Document v3.docx
@@ -5808,13 +5808,10 @@
     <w:p>
       <w:pPr>
         <w:rPr>
-          <w:b/>
-          <w:sz w:val="24"/>
-          <w:szCs w:val="24"/>
-        </w:rPr>
-      </w:pPr>
-      <w:bookmarkStart w:id="1" w:name="_GoBack"/>
-      <w:bookmarkEnd w:id="1"/>
+          <w:noProof/>
+          <w:lang w:val="tr-TR" w:eastAsia="tr-TR"/>
+        </w:rPr>
+      </w:pPr>
       <w:r>
         <w:rPr>
           <w:noProof/>
@@ -5876,6 +5873,15 @@
         </w:rPr>
         <w:br w:type="page"/>
       </w:r>
+    </w:p>
+    <w:p>
+      <w:pPr>
+        <w:rPr>
+          <w:b/>
+          <w:sz w:val="24"/>
+          <w:szCs w:val="24"/>
+        </w:rPr>
+      </w:pPr>
       <w:r>
         <w:rPr>
           <w:b/>
@@ -5889,31 +5895,30 @@
     <w:p>
       <w:pPr>
         <w:rPr>
-          <w:b/>
-        </w:rPr>
-      </w:pPr>
-      <w:r>
-        <w:rPr>
-          <w:b/>
-          <w:bCs/>
           <w:noProof/>
-          <w:sz w:val="24"/>
-          <w:szCs w:val="24"/>
           <w:lang w:val="tr-TR" w:eastAsia="tr-TR"/>
         </w:rPr>
+      </w:pPr>
+      <w:bookmarkStart w:id="1" w:name="_GoBack"/>
+      <w:bookmarkEnd w:id="1"/>
+      <w:r>
+        <w:rPr>
+          <w:noProof/>
+          <w:lang w:val="tr-TR" w:eastAsia="tr-TR"/>
+        </w:rPr>
         <w:drawing>
-          <wp:anchor distT="0" distB="0" distL="114300" distR="114300" simplePos="0" relativeHeight="251669504" behindDoc="1" locked="0" layoutInCell="1" allowOverlap="1" wp14:anchorId="5AC46C9D" wp14:editId="3C87A45E">
+          <wp:anchor distT="0" distB="0" distL="114300" distR="114300" simplePos="0" relativeHeight="251671552" behindDoc="1" locked="0" layoutInCell="1" allowOverlap="1" wp14:anchorId="5D9FC913" wp14:editId="0F950B50">
             <wp:simplePos x="0" y="0"/>
-            <wp:positionH relativeFrom="margin">
-              <wp:posOffset>0</wp:posOffset>
+            <wp:positionH relativeFrom="column">
+              <wp:posOffset>586105</wp:posOffset>
             </wp:positionH>
             <wp:positionV relativeFrom="paragraph">
-              <wp:posOffset>0</wp:posOffset>
+              <wp:posOffset>238125</wp:posOffset>
             </wp:positionV>
-            <wp:extent cx="5845629" cy="8422860"/>
-            <wp:effectExtent l="0" t="0" r="3175" b="0"/>
+            <wp:extent cx="4632960" cy="6682799"/>
+            <wp:effectExtent l="0" t="0" r="0" b="3810"/>
             <wp:wrapNone/>
-            <wp:docPr id="11" name="Resim 11"/>
+            <wp:docPr id="4" name="Resim 4"/>
             <wp:cNvGraphicFramePr>
               <a:graphicFrameLocks xmlns:a="http://schemas.openxmlformats.org/drawingml/2006/main" noChangeAspect="1"/>
             </wp:cNvGraphicFramePr>
@@ -5924,26 +5929,33 @@
                     <pic:cNvPr id="1" name=""/>
                     <pic:cNvPicPr/>
                   </pic:nvPicPr>
-                  <pic:blipFill>
-                    <a:blip r:embed="rId15">
+                  <pic:blipFill rotWithShape="1">
+                    <a:blip r:embed="rId15" cstate="print">
                       <a:extLst>
                         <a:ext uri="{28A0092B-C50C-407E-A947-70E740481C1C}">
                           <a14:useLocalDpi xmlns:a14="http://schemas.microsoft.com/office/drawing/2010/main" val="0"/>
                         </a:ext>
                       </a:extLst>
                     </a:blip>
-                    <a:stretch>
-                      <a:fillRect/>
-                    </a:stretch>
+                    <a:srcRect l="44370" t="18342" r="25862" b="5321"/>
+                    <a:stretch/>
                   </pic:blipFill>
-                  <pic:spPr>
+                  <pic:spPr bwMode="auto">
                     <a:xfrm>
                       <a:off x="0" y="0"/>
-                      <a:ext cx="5848733" cy="8427333"/>
+                      <a:ext cx="4632960" cy="6682799"/>
                     </a:xfrm>
                     <a:prstGeom prst="rect">
                       <a:avLst/>
                     </a:prstGeom>
+                    <a:ln>
+                      <a:noFill/>
+                    </a:ln>
+                    <a:extLst>
+                      <a:ext uri="{53640926-AAD7-44D8-BBD7-CCE9431645EC}">
+                        <a14:shadowObscured xmlns:a14="http://schemas.microsoft.com/office/drawing/2010/main"/>
+                      </a:ext>
+                    </a:extLst>
                   </pic:spPr>
                 </pic:pic>
               </a:graphicData>
@@ -5957,6 +5969,21 @@
           </wp:anchor>
         </w:drawing>
       </w:r>
+    </w:p>
+    <w:p>
+      <w:pPr>
+        <w:rPr>
+          <w:noProof/>
+          <w:lang w:val="tr-TR" w:eastAsia="tr-TR"/>
+        </w:rPr>
+      </w:pPr>
+    </w:p>
+    <w:p>
+      <w:pPr>
+        <w:rPr>
+          <w:b/>
+        </w:rPr>
+      </w:pPr>
       <w:r>
         <w:rPr>
           <w:b/>
@@ -16301,7 +16328,7 @@
 </file>
 
 <file path=customXml/itemProps1.xml><?xml version="1.0" encoding="utf-8"?>
-<ds:datastoreItem xmlns:ds="http://schemas.openxmlformats.org/officeDocument/2006/customXml" ds:itemID="{7837A7A3-BA54-46F4-89F9-9D88C74F12AD}">
+<ds:datastoreItem xmlns:ds="http://schemas.openxmlformats.org/officeDocument/2006/customXml" ds:itemID="{7459A277-0DE3-4000-8501-80C4BECB3235}">
   <ds:schemaRefs>
     <ds:schemaRef ds:uri="http://schemas.openxmlformats.org/officeDocument/2006/bibliography"/>
   </ds:schemaRefs>

</xml_diff>